<commit_message>
docs: FD-11 is_user_facing note + Cold Start Design Spec (swipe blend) addendum
- Founder Decision Register: FD-11 note confirming main_ingredient_class
  tags are is_user_facing=false, ratified, revisit only if a future
  feature needs user-facing filtering by ingredient class.
- New DRAFT addendum: Cold Start Design Specification — Day-1 Swipe
  Blend, filed alongside RE-DOC-01..04 per the addendum convention.
  Defines how OB-07 onboarding swipes feed the existing weight ladder
  (no new mechanism) for a user's first generated plan. Founder
  sign-off still pending; commit-only, no implementation.
- RE-DOC-04: one-line "see also" cross-reference to the new addendum,
  inserted after the cold-start fallback section; no other content
  changed.

Co-Authored-By: Claude Sonnet 5 <noreply@anthropic.com>
</commit_message>
<xml_diff>
--- a/docs/architecture/[ACTIVE]_RE-DOC-04_ColdStart_Variety_Suppression.docx
+++ b/docs/architecture/[ACTIVE]_RE-DOC-04_ColdStart_Variety_Suppression.docx
@@ -2756,6 +2756,14 @@
       </w:pPr>
       <w:r>
         <w:t xml:space="preserve"/>
+      </w:r>
+    </w:p>
+    <w:p>
+      <w:r>
+        <w:rPr>
+          <w:i/>
+        </w:rPr>
+        <w:t>See also: [DRAFT]_Cold_Start_Design_Specification_Swipe_Blend_v1.0.md — addendum defining how OB-07 onboarding swipes interact with the Day-0/Day-1 cold-start fallback above via the existing weight ladder (no new mechanism introduced).</w:t>
       </w:r>
     </w:p>
     <w:p>

</xml_diff>